<commit_message>
Map 18 bracketed placeholder gaps to fillable fields across 9 templates
Add replacements.json mappings and metadata.yaml fields for bracketed
drafting notes that were rendering as yellow-highlighted placeholders.
Also fix design partner agreement duplicate {other_details} markers by
splitting into {partner_other_details} and {provider_other_details}.

Templates updated: ai-addendum, BAA, design-partner, contractor,
order-form, order-form-with-sla, partnership, PSA, statement-of-work.
</commit_message>
<xml_diff>
--- a/content/templates/common-paper-design-partner-agreement/template.docx
+++ b/content/templates/common-paper-design-partner-agreement/template.docx
@@ -932,7 +932,7 @@
                 <w:szCs w:val="16"/>
                 <w:highlight w:val="yellow"/>
               </w:rPr>
-              <w:t xml:space="preserve">{other_details}</w:t>
+              <w:t xml:space="preserve">{partner_other_details}</w:t>
             </w:r>
             <w:proofErr w:type="gramStart"/>
             <w:proofErr w:type="gramEnd"/>
@@ -1316,7 +1316,7 @@
                 <w:szCs w:val="16"/>
                 <w:highlight w:val="yellow"/>
               </w:rPr>
-              <w:t>{other_details}</w:t>
+              <w:t>{provider_other_details}</w:t>
             </w:r>
           </w:p>
         </w:tc>

</xml_diff>